<commit_message>
Fix workflow figure label layout
</commit_message>
<xml_diff>
--- a/paper/manuscript.docx
+++ b/paper/manuscript.docx
@@ -562,7 +562,7 @@
       <w:r>
         <w:drawing>
           <wp:inline xmlns:a="http://schemas.openxmlformats.org/drawingml/2006/main" xmlns:pic="http://schemas.openxmlformats.org/drawingml/2006/picture">
-            <wp:extent cx="5394960" cy="1853608"/>
+            <wp:extent cx="5394960" cy="1818689"/>
             <wp:docPr id="1" name="Picture 1"/>
             <wp:cNvGraphicFramePr>
               <a:graphicFrameLocks noChangeAspect="1"/>
@@ -583,7 +583,7 @@
                   <pic:spPr>
                     <a:xfrm>
                       <a:off x="0" y="0"/>
-                      <a:ext cx="5394960" cy="1853608"/>
+                      <a:ext cx="5394960" cy="1818689"/>
                     </a:xfrm>
                     <a:prstGeom prst="rect"/>
                   </pic:spPr>

</xml_diff>

<commit_message>
Update manuscript framing and repo metadata
</commit_message>
<xml_diff>
--- a/paper/manuscript.docx
+++ b/paper/manuscript.docx
@@ -8,7 +8,7 @@
         <w:jc w:val="center"/>
       </w:pPr>
       <w:r>
-        <w:t>Is more thinking always better? Think again: Less reasoning, better sensory predictions in sensometrics</w:t>
+        <w:t>Is more thinking always better? Think again: Model-cognition fit in AI-supported sensory analysis</w:t>
       </w:r>
     </w:p>
     <w:p>
@@ -2021,7 +2021,7 @@
     </w:p>
     <w:p>
       <w:r>
-        <w:t>Data, analysis scripts, generated scoring artifacts, figures, and manuscript build files will be made available in a public GitHub repository at https://github.com/aigorahub/model-cognition-fit-llm-ifc-ham.</w:t>
+        <w:t>Data, analysis scripts, generated scoring artifacts, figures, and manuscript build files will be made available in a public GitHub repository at https://github.com/aigorahub/model-cognition-fit-ai-sensory-analysis.</w:t>
       </w:r>
     </w:p>
     <w:p>

</xml_diff>

<commit_message>
Tighten paper reproducibility and review findings
</commit_message>
<xml_diff>
--- a/paper/manuscript.docx
+++ b/paper/manuscript.docx
@@ -74,7 +74,7 @@
     </w:p>
     <w:p>
       <w:r>
-        <w:t>Larger and more deliberative language models are often assumed to be better scoring instruments. That assumption may fail when the target response is sensory, affective, and fast. We tested this idea in a consumer cooked-ham study where the task was to score how closely each evaluated product matched each consumer's own ideal product. The data came from a published Ideal-Free-Comment study: 2,758 home-use evaluations from 483 French consumers across 30 commercial cooked hams. Consumers described actual products and their ideal ham using Free-Comment across visual appearance, texture, and flavor, then rated liking on a 0-10 visual analogue scale. For each evaluation, a large language model compared actual and ideal comments and returned structured Likert alignment scores. Those scores were used to predict liking under consumer-group holdout validation. A raw embedding cosine-similarity baseline performed poorly, with R² near 0.20 and MAE near 1.83. Direct LLM alignment scoring improved prediction substantially. In the primary analysis, Gemini 2.5 Flash Lite, a non-thinking direct-response model, reached R² = 0.573 and MAE = 1.22 with a six-point scale and temperature 0.7; bootstrap validation gave mean R² = 0.504. Reasoning-oriented Gemini 3 Flash configurations were slower, less accurate, and more prone to structured-output failures. Topic-level validation recovered the published modality hierarchy, with flavor strongest, texture second, and visual appearance weakest. The findings support a model-cognition fit hypothesis: for sensory and consumer scoring tasks, non-thinking models can be better matched to the fast judgment process being measured, while reasoning models may add cost and noise.</w:t>
+        <w:t>Larger and more deliberative language models are often assumed to be better scoring instruments. That assumption may fail when the target response is sensory, affective, and fast. We tested this idea in a consumer cooked-ham study where the task was to score how closely each evaluated product matched each consumer's own ideal product. The data came from a published Ideal-Free-Comment study: 2,758 home-use evaluations from 483 French consumers across 30 commercial cooked hams. Consumers described actual products and their ideal ham using Free-Comment across visual appearance, texture, and flavor, then rated liking on a 0-10 visual analogue scale. For each evaluation, a large language model compared actual and ideal comments and returned structured Likert alignment scores. Those scores were used to predict liking under consumer-group holdout validation. A raw embedding cosine-similarity baseline performed poorly, with R² near 0.20 and MAE near 1.83. Direct LLM alignment scoring improved prediction substantially. In the primary analysis, Gemini 2.5 Flash Lite, a non-thinking direct-response model, reached R² = 0.573 and MAE = 1.22 with a six-point scale and temperature 0.7; bootstrap validation gave mean R² = 0.504. Reasoning-oriented Gemini 3 Flash configurations were slower, less accurate, and showed more row-level scoring errors in controlled six-point comparisons. Topic-level validation recovered the published modality hierarchy, with flavor strongest, texture second, and visual appearance weakest. The findings support a model-cognition fit hypothesis: for sensory and consumer scoring tasks, non-thinking models can be better matched to the fast judgment process being measured, while reasoning models may add cost and noise.</w:t>
       </w:r>
     </w:p>
     <w:p>
@@ -326,6 +326,67 @@
                 <w:b/>
                 <w:sz w:val="20"/>
               </w:rPr>
+              <w:t>Quantity</w:t>
+            </w:r>
+          </w:p>
+        </w:tc>
+        <w:tc>
+          <w:tcPr>
+            <w:tcW w:type="dxa" w:w="4680"/>
+          </w:tcPr>
+          <w:p>
+            <w:r>
+              <w:rPr>
+                <w:rFonts w:ascii="Times New Roman" w:hAnsi="Times New Roman"/>
+                <w:b/>
+                <w:sz w:val="20"/>
+              </w:rPr>
+              <w:t>Value</w:t>
+            </w:r>
+          </w:p>
+        </w:tc>
+      </w:tr>
+      <w:tr>
+        <w:tc>
+          <w:tcPr>
+            <w:tcW w:type="dxa" w:w="4680"/>
+          </w:tcPr>
+          <w:p>
+            <w:r>
+              <w:rPr>
+                <w:rFonts w:ascii="Times New Roman" w:hAnsi="Times New Roman"/>
+                <w:sz w:val="20"/>
+              </w:rPr>
+              <w:t>Consumers</w:t>
+            </w:r>
+          </w:p>
+        </w:tc>
+        <w:tc>
+          <w:tcPr>
+            <w:tcW w:type="dxa" w:w="4680"/>
+          </w:tcPr>
+          <w:p>
+            <w:r>
+              <w:rPr>
+                <w:rFonts w:ascii="Times New Roman" w:hAnsi="Times New Roman"/>
+                <w:sz w:val="20"/>
+              </w:rPr>
+              <w:t>483 French consumers</w:t>
+            </w:r>
+          </w:p>
+        </w:tc>
+      </w:tr>
+      <w:tr>
+        <w:tc>
+          <w:tcPr>
+            <w:tcW w:type="dxa" w:w="4680"/>
+          </w:tcPr>
+          <w:p>
+            <w:r>
+              <w:rPr>
+                <w:rFonts w:ascii="Times New Roman" w:hAnsi="Times New Roman"/>
+                <w:sz w:val="20"/>
+              </w:rPr>
               <w:t>Products</w:t>
             </w:r>
           </w:p>
@@ -338,7 +399,6 @@
             <w:r>
               <w:rPr>
                 <w:rFonts w:ascii="Times New Roman" w:hAnsi="Times New Roman"/>
-                <w:b/>
                 <w:sz w:val="20"/>
               </w:rPr>
               <w:t>30 commercial cooked hams</w:t>
@@ -521,6 +581,9 @@
       </w:r>
     </w:p>
     <w:p>
+      <w:pPr>
+        <w:pStyle w:val="Heading3"/>
+      </w:pPr>
       <w:r>
         <w:t>Scoring prompt and response format</w:t>
       </w:r>
@@ -550,7 +613,7 @@
     </w:p>
     <w:p>
       <w:r>
-        <w:t>Responses were parsed as JSON, coerced to integers, and accepted only when all three fields were present and all scores were within the allowed range. If direct JSON parsing failed, a regex fallback attempted to recover the three named scores. Rows that still failed parsing were counted as structured-output failures. Missing comments were passed as (empty) rather than silently removed.</w:t>
+        <w:t>Responses were parsed as JSON, coerced to integers, and accepted only when all three fields were present and all scores were within the allowed range. If direct JSON parsing failed, a regex fallback attempted to recover the three named scores. Rows that still failed parsing were counted as parse failures. In the grid artifacts, the broader error count records row-level scoring errors observed during generation, including API or parsing failures before retry or recovery. Missing comments were passed as (empty) rather than silently removed.</w:t>
       </w:r>
     </w:p>
     <w:p>
@@ -603,13 +666,16 @@
       </w:r>
     </w:p>
     <w:p>
+      <w:pPr>
+        <w:pStyle w:val="Heading3"/>
+      </w:pPr>
       <w:r>
         <w:t>Model grid and validation design</w:t>
       </w:r>
     </w:p>
     <w:p>
       <w:r>
-        <w:t>The model grid tested the paper's central hypothesis. If sensory alignment scoring behaves like a fast judgment task, non-thinking models should score it well. If extra reasoning improves the measurement, Gemini 3 Flash thinking configurations should outperform Flash Lite. The presentation analysis described a 27-configuration grid: three model configurations by three scale granularities by three temperatures. The core task, JSON schema, dataset, and downstream evaluation procedure were held fixed.</w:t>
+        <w:t>The model grid tested the paper's central hypothesis. If sensory alignment scoring behaves like a fast judgment task, non-thinking models should score it well. If extra reasoning improves the measurement, Gemini 3 Flash thinking configurations should outperform Flash Lite. The main grid used 27 configurations: three model configurations by three scale granularities by three temperatures. The core task, JSON schema, dataset, and downstream evaluation procedure were held fixed.</w:t>
       </w:r>
     </w:p>
     <w:p>
@@ -643,7 +709,7 @@
                 <w:b/>
                 <w:sz w:val="20"/>
               </w:rPr>
-              <w:t>Scale size</w:t>
+              <w:t>Factor</w:t>
             </w:r>
           </w:p>
         </w:tc>
@@ -658,6 +724,95 @@
                 <w:b/>
                 <w:sz w:val="20"/>
               </w:rPr>
+              <w:t>Levels varied</w:t>
+            </w:r>
+          </w:p>
+        </w:tc>
+        <w:tc>
+          <w:tcPr>
+            <w:tcW w:type="dxa" w:w="3120"/>
+          </w:tcPr>
+          <w:p>
+            <w:r>
+              <w:rPr>
+                <w:rFonts w:ascii="Times New Roman" w:hAnsi="Times New Roman"/>
+                <w:b/>
+                <w:sz w:val="20"/>
+              </w:rPr>
+              <w:t>Held fixed</w:t>
+            </w:r>
+          </w:p>
+        </w:tc>
+      </w:tr>
+      <w:tr>
+        <w:tc>
+          <w:tcPr>
+            <w:tcW w:type="dxa" w:w="3120"/>
+          </w:tcPr>
+          <w:p>
+            <w:r>
+              <w:rPr>
+                <w:rFonts w:ascii="Times New Roman" w:hAnsi="Times New Roman"/>
+                <w:sz w:val="20"/>
+              </w:rPr>
+              <w:t>Model</w:t>
+            </w:r>
+          </w:p>
+        </w:tc>
+        <w:tc>
+          <w:tcPr>
+            <w:tcW w:type="dxa" w:w="3120"/>
+          </w:tcPr>
+          <w:p>
+            <w:r>
+              <w:rPr>
+                <w:rFonts w:ascii="Times New Roman" w:hAnsi="Times New Roman"/>
+                <w:sz w:val="20"/>
+              </w:rPr>
+              <w:t>Gemini 2.5 Flash Lite; Gemini 3 Flash minimal; Gemini 3 Flash low</w:t>
+            </w:r>
+          </w:p>
+        </w:tc>
+        <w:tc>
+          <w:tcPr>
+            <w:tcW w:type="dxa" w:w="3120"/>
+          </w:tcPr>
+          <w:p>
+            <w:r>
+              <w:rPr>
+                <w:rFonts w:ascii="Times New Roman" w:hAnsi="Times New Roman"/>
+                <w:sz w:val="20"/>
+              </w:rPr>
+              <w:t>Prompt task and JSON schema</w:t>
+            </w:r>
+          </w:p>
+        </w:tc>
+      </w:tr>
+      <w:tr>
+        <w:tc>
+          <w:tcPr>
+            <w:tcW w:type="dxa" w:w="3120"/>
+          </w:tcPr>
+          <w:p>
+            <w:r>
+              <w:rPr>
+                <w:rFonts w:ascii="Times New Roman" w:hAnsi="Times New Roman"/>
+                <w:sz w:val="20"/>
+              </w:rPr>
+              <w:t>Scale size</w:t>
+            </w:r>
+          </w:p>
+        </w:tc>
+        <w:tc>
+          <w:tcPr>
+            <w:tcW w:type="dxa" w:w="3120"/>
+          </w:tcPr>
+          <w:p>
+            <w:r>
+              <w:rPr>
+                <w:rFonts w:ascii="Times New Roman" w:hAnsi="Times New Roman"/>
+                <w:sz w:val="20"/>
+              </w:rPr>
               <w:t>4-point, 6-point, 8-point Likert scales</w:t>
             </w:r>
           </w:p>
@@ -670,7 +825,6 @@
             <w:r>
               <w:rPr>
                 <w:rFonts w:ascii="Times New Roman" w:hAnsi="Times New Roman"/>
-                <w:b/>
                 <w:sz w:val="20"/>
               </w:rPr>
               <w:t>Actual-versus-ideal comparison</w:t>
@@ -781,6 +935,9 @@
       </w:r>
     </w:p>
     <w:p>
+      <w:pPr>
+        <w:pStyle w:val="Heading3"/>
+      </w:pPr>
       <w:r>
         <w:t>Baselines and downstream prediction</w:t>
       </w:r>
@@ -809,6 +966,9 @@
       </w:r>
     </w:p>
     <w:p>
+      <w:pPr>
+        <w:pStyle w:val="Heading3"/>
+      </w:pPr>
       <w:r>
         <w:t>Topic-level validation</w:t>
       </w:r>
@@ -854,7 +1014,7 @@
     </w:p>
     <w:p>
       <w:r>
-        <w:t>The best presentation configuration used Gemini 2.5 Flash Lite, no thinking, a six-point scale, and temperature 0.7. It reached R² = 0.573 and MAE = 1.22 on the main split. Bootstrap validation produced mean R² = 0.504 with a 95% interval of [0.429, 0.582].</w:t>
+        <w:t>The best grid configuration used Gemini 2.5 Flash Lite, no thinking, a six-point scale, and temperature 0.7. It reached R² = 0.573 and MAE = 1.22 on the main split. Bootstrap validation of this configuration produced mean R² = 0.504 with a 95% interval of [0.429, 0.582]. To avoid confounding model choice with scale size or temperature, Table~tab:primary compares the three model configurations at the same six-point scale and temperature 0.7.</w:t>
       </w:r>
     </w:p>
     <w:p>
@@ -862,7 +1022,7 @@
         <w:pStyle w:val="Caption"/>
       </w:pPr>
       <w:r>
-        <w:t>Primary predictive and operational results.</w:t>
+        <w:t>Controlled predictive and operational comparison at six points and temperature 0.7.</w:t>
       </w:r>
     </w:p>
     <w:tbl>
@@ -872,18 +1032,17 @@
         <w:tblLook w:firstColumn="1" w:firstRow="1" w:lastColumn="0" w:lastRow="0" w:noHBand="0" w:noVBand="1" w:val="04A0"/>
       </w:tblPr>
       <w:tblGrid>
-        <w:gridCol w:w="1337"/>
-        <w:gridCol w:w="1337"/>
-        <w:gridCol w:w="1337"/>
-        <w:gridCol w:w="1337"/>
-        <w:gridCol w:w="1337"/>
-        <w:gridCol w:w="1337"/>
-        <w:gridCol w:w="1337"/>
+        <w:gridCol w:w="1560"/>
+        <w:gridCol w:w="1560"/>
+        <w:gridCol w:w="1560"/>
+        <w:gridCol w:w="1560"/>
+        <w:gridCol w:w="1560"/>
+        <w:gridCol w:w="1560"/>
       </w:tblGrid>
       <w:tr>
         <w:tc>
           <w:tcPr>
-            <w:tcW w:type="dxa" w:w="1337"/>
+            <w:tcW w:type="dxa" w:w="1560"/>
           </w:tcPr>
           <w:p>
             <w:r>
@@ -892,13 +1051,13 @@
                 <w:b/>
                 <w:sz w:val="20"/>
               </w:rPr>
-              <w:t>Gemini 2.5 Flash Lite</w:t>
+              <w:t>Configuration</w:t>
             </w:r>
           </w:p>
         </w:tc>
         <w:tc>
           <w:tcPr>
-            <w:tcW w:type="dxa" w:w="1337"/>
+            <w:tcW w:type="dxa" w:w="1560"/>
           </w:tcPr>
           <w:p>
             <w:r>
@@ -907,13 +1066,13 @@
                 <w:b/>
                 <w:sz w:val="20"/>
               </w:rPr>
-              <w:t>6 pt, 0.7</w:t>
+              <w:t>Scale, temp.</w:t>
             </w:r>
           </w:p>
         </w:tc>
         <w:tc>
           <w:tcPr>
-            <w:tcW w:type="dxa" w:w="1337"/>
+            <w:tcW w:type="dxa" w:w="1560"/>
           </w:tcPr>
           <w:p>
             <w:r>
@@ -922,13 +1081,13 @@
                 <w:b/>
                 <w:sz w:val="20"/>
               </w:rPr>
-              <w:t>0.573</w:t>
+              <w:t>R²</w:t>
             </w:r>
           </w:p>
         </w:tc>
         <w:tc>
           <w:tcPr>
-            <w:tcW w:type="dxa" w:w="1337"/>
+            <w:tcW w:type="dxa" w:w="1560"/>
           </w:tcPr>
           <w:p>
             <w:r>
@@ -937,13 +1096,13 @@
                 <w:b/>
                 <w:sz w:val="20"/>
               </w:rPr>
-              <w:t>0.504 [0.429, 0.582]</w:t>
+              <w:t>MAE</w:t>
             </w:r>
           </w:p>
         </w:tc>
         <w:tc>
           <w:tcPr>
-            <w:tcW w:type="dxa" w:w="1337"/>
+            <w:tcW w:type="dxa" w:w="1560"/>
           </w:tcPr>
           <w:p>
             <w:r>
@@ -952,13 +1111,13 @@
                 <w:b/>
                 <w:sz w:val="20"/>
               </w:rPr>
-              <w:t>1.22</w:t>
+              <w:t>Time (s)</w:t>
             </w:r>
           </w:p>
         </w:tc>
         <w:tc>
           <w:tcPr>
-            <w:tcW w:type="dxa" w:w="1337"/>
+            <w:tcW w:type="dxa" w:w="1560"/>
           </w:tcPr>
           <w:p>
             <w:r>
@@ -967,22 +1126,7 @@
                 <w:b/>
                 <w:sz w:val="20"/>
               </w:rPr>
-              <w:t>102</w:t>
-            </w:r>
-          </w:p>
-        </w:tc>
-        <w:tc>
-          <w:tcPr>
-            <w:tcW w:type="dxa" w:w="1337"/>
-          </w:tcPr>
-          <w:p>
-            <w:r>
-              <w:rPr>
-                <w:rFonts w:ascii="Times New Roman" w:hAnsi="Times New Roman"/>
-                <w:b/>
-                <w:sz w:val="20"/>
-              </w:rPr>
-              <w:t>0.02%</w:t>
+              <w:t>Scoring errors</w:t>
             </w:r>
           </w:p>
         </w:tc>
@@ -990,7 +1134,179 @@
       <w:tr>
         <w:tc>
           <w:tcPr>
-            <w:tcW w:type="dxa" w:w="1337"/>
+            <w:tcW w:type="dxa" w:w="1560"/>
+          </w:tcPr>
+          <w:p>
+            <w:r>
+              <w:rPr>
+                <w:rFonts w:ascii="Times New Roman" w:hAnsi="Times New Roman"/>
+                <w:sz w:val="20"/>
+              </w:rPr>
+              <w:t>Embedding baseline</w:t>
+            </w:r>
+          </w:p>
+        </w:tc>
+        <w:tc>
+          <w:tcPr>
+            <w:tcW w:type="dxa" w:w="1560"/>
+          </w:tcPr>
+          <w:p>
+            <w:r>
+              <w:rPr>
+                <w:rFonts w:ascii="Times New Roman" w:hAnsi="Times New Roman"/>
+                <w:sz w:val="20"/>
+              </w:rPr>
+              <w:t>-</w:t>
+            </w:r>
+          </w:p>
+        </w:tc>
+        <w:tc>
+          <w:tcPr>
+            <w:tcW w:type="dxa" w:w="1560"/>
+          </w:tcPr>
+          <w:p>
+            <w:r>
+              <w:rPr>
+                <w:rFonts w:ascii="Times New Roman" w:hAnsi="Times New Roman"/>
+                <w:sz w:val="20"/>
+              </w:rPr>
+              <w:t>0.200</w:t>
+            </w:r>
+          </w:p>
+        </w:tc>
+        <w:tc>
+          <w:tcPr>
+            <w:tcW w:type="dxa" w:w="1560"/>
+          </w:tcPr>
+          <w:p>
+            <w:r>
+              <w:rPr>
+                <w:rFonts w:ascii="Times New Roman" w:hAnsi="Times New Roman"/>
+                <w:sz w:val="20"/>
+              </w:rPr>
+              <w:t>1.83</w:t>
+            </w:r>
+          </w:p>
+        </w:tc>
+        <w:tc>
+          <w:tcPr>
+            <w:tcW w:type="dxa" w:w="1560"/>
+          </w:tcPr>
+          <w:p>
+            <w:r>
+              <w:rPr>
+                <w:rFonts w:ascii="Times New Roman" w:hAnsi="Times New Roman"/>
+                <w:sz w:val="20"/>
+              </w:rPr>
+              <w:t>&lt;5</w:t>
+            </w:r>
+          </w:p>
+        </w:tc>
+        <w:tc>
+          <w:tcPr>
+            <w:tcW w:type="dxa" w:w="1560"/>
+          </w:tcPr>
+          <w:p>
+            <w:r>
+              <w:rPr>
+                <w:rFonts w:ascii="Times New Roman" w:hAnsi="Times New Roman"/>
+                <w:sz w:val="20"/>
+              </w:rPr>
+              <w:t>0 (0.0%)</w:t>
+            </w:r>
+          </w:p>
+        </w:tc>
+      </w:tr>
+      <w:tr>
+        <w:tc>
+          <w:tcPr>
+            <w:tcW w:type="dxa" w:w="1560"/>
+          </w:tcPr>
+          <w:p>
+            <w:r>
+              <w:rPr>
+                <w:rFonts w:ascii="Times New Roman" w:hAnsi="Times New Roman"/>
+                <w:sz w:val="20"/>
+              </w:rPr>
+              <w:t>Gemini 2.5 Flash Lite</w:t>
+            </w:r>
+          </w:p>
+        </w:tc>
+        <w:tc>
+          <w:tcPr>
+            <w:tcW w:type="dxa" w:w="1560"/>
+          </w:tcPr>
+          <w:p>
+            <w:r>
+              <w:rPr>
+                <w:rFonts w:ascii="Times New Roman" w:hAnsi="Times New Roman"/>
+                <w:sz w:val="20"/>
+              </w:rPr>
+              <w:t>6 pt, 0.7</w:t>
+            </w:r>
+          </w:p>
+        </w:tc>
+        <w:tc>
+          <w:tcPr>
+            <w:tcW w:type="dxa" w:w="1560"/>
+          </w:tcPr>
+          <w:p>
+            <w:r>
+              <w:rPr>
+                <w:rFonts w:ascii="Times New Roman" w:hAnsi="Times New Roman"/>
+                <w:sz w:val="20"/>
+              </w:rPr>
+              <w:t>0.573</w:t>
+            </w:r>
+          </w:p>
+        </w:tc>
+        <w:tc>
+          <w:tcPr>
+            <w:tcW w:type="dxa" w:w="1560"/>
+          </w:tcPr>
+          <w:p>
+            <w:r>
+              <w:rPr>
+                <w:rFonts w:ascii="Times New Roman" w:hAnsi="Times New Roman"/>
+                <w:sz w:val="20"/>
+              </w:rPr>
+              <w:t>1.22</w:t>
+            </w:r>
+          </w:p>
+        </w:tc>
+        <w:tc>
+          <w:tcPr>
+            <w:tcW w:type="dxa" w:w="1560"/>
+          </w:tcPr>
+          <w:p>
+            <w:r>
+              <w:rPr>
+                <w:rFonts w:ascii="Times New Roman" w:hAnsi="Times New Roman"/>
+                <w:sz w:val="20"/>
+              </w:rPr>
+              <w:t>101</w:t>
+            </w:r>
+          </w:p>
+        </w:tc>
+        <w:tc>
+          <w:tcPr>
+            <w:tcW w:type="dxa" w:w="1560"/>
+          </w:tcPr>
+          <w:p>
+            <w:r>
+              <w:rPr>
+                <w:rFonts w:ascii="Times New Roman" w:hAnsi="Times New Roman"/>
+                <w:sz w:val="20"/>
+              </w:rPr>
+              <w:t>114 (4.1%)</w:t>
+            </w:r>
+          </w:p>
+        </w:tc>
+      </w:tr>
+      <w:tr>
+        <w:tc>
+          <w:tcPr>
+            <w:tcW w:type="dxa" w:w="1560"/>
           </w:tcPr>
           <w:p>
             <w:r>
@@ -1004,7 +1320,7 @@
         </w:tc>
         <w:tc>
           <w:tcPr>
-            <w:tcW w:type="dxa" w:w="1337"/>
+            <w:tcW w:type="dxa" w:w="1560"/>
           </w:tcPr>
           <w:p>
             <w:r>
@@ -1012,13 +1328,13 @@
                 <w:rFonts w:ascii="Times New Roman" w:hAnsi="Times New Roman"/>
                 <w:sz w:val="20"/>
               </w:rPr>
-              <w:t>8 pt, 0.7</w:t>
+              <w:t>6 pt, 0.7</w:t>
             </w:r>
           </w:p>
         </w:tc>
         <w:tc>
           <w:tcPr>
-            <w:tcW w:type="dxa" w:w="1337"/>
+            <w:tcW w:type="dxa" w:w="1560"/>
           </w:tcPr>
           <w:p>
             <w:r>
@@ -1026,13 +1342,13 @@
                 <w:rFonts w:ascii="Times New Roman" w:hAnsi="Times New Roman"/>
                 <w:sz w:val="20"/>
               </w:rPr>
-              <w:t>0.518</w:t>
+              <w:t>0.479</w:t>
             </w:r>
           </w:p>
         </w:tc>
         <w:tc>
           <w:tcPr>
-            <w:tcW w:type="dxa" w:w="1337"/>
+            <w:tcW w:type="dxa" w:w="1560"/>
           </w:tcPr>
           <w:p>
             <w:r>
@@ -1040,13 +1356,13 @@
                 <w:rFonts w:ascii="Times New Roman" w:hAnsi="Times New Roman"/>
                 <w:sz w:val="20"/>
               </w:rPr>
-              <w:t>0.462 [0.388, 0.531]</w:t>
+              <w:t>1.33</w:t>
             </w:r>
           </w:p>
         </w:tc>
         <w:tc>
           <w:tcPr>
-            <w:tcW w:type="dxa" w:w="1337"/>
+            <w:tcW w:type="dxa" w:w="1560"/>
           </w:tcPr>
           <w:p>
             <w:r>
@@ -1054,13 +1370,13 @@
                 <w:rFonts w:ascii="Times New Roman" w:hAnsi="Times New Roman"/>
                 <w:sz w:val="20"/>
               </w:rPr>
-              <w:t>1.26</w:t>
+              <w:t>619</w:t>
             </w:r>
           </w:p>
         </w:tc>
         <w:tc>
           <w:tcPr>
-            <w:tcW w:type="dxa" w:w="1337"/>
+            <w:tcW w:type="dxa" w:w="1560"/>
           </w:tcPr>
           <w:p>
             <w:r>
@@ -1068,21 +1384,7 @@
                 <w:rFonts w:ascii="Times New Roman" w:hAnsi="Times New Roman"/>
                 <w:sz w:val="20"/>
               </w:rPr>
-              <w:t>614</w:t>
-            </w:r>
-          </w:p>
-        </w:tc>
-        <w:tc>
-          <w:tcPr>
-            <w:tcW w:type="dxa" w:w="1337"/>
-          </w:tcPr>
-          <w:p>
-            <w:r>
-              <w:rPr>
-                <w:rFonts w:ascii="Times New Roman" w:hAnsi="Times New Roman"/>
-                <w:sz w:val="20"/>
-              </w:rPr>
-              <w:t>0.15%</w:t>
+              <w:t>137 (5.0%)</w:t>
             </w:r>
           </w:p>
         </w:tc>
@@ -1090,7 +1392,7 @@
       <w:tr>
         <w:tc>
           <w:tcPr>
-            <w:tcW w:type="dxa" w:w="1337"/>
+            <w:tcW w:type="dxa" w:w="1560"/>
           </w:tcPr>
           <w:p>
             <w:r>
@@ -1104,7 +1406,7 @@
         </w:tc>
         <w:tc>
           <w:tcPr>
-            <w:tcW w:type="dxa" w:w="1337"/>
+            <w:tcW w:type="dxa" w:w="1560"/>
           </w:tcPr>
           <w:p>
             <w:r>
@@ -1112,13 +1414,13 @@
                 <w:rFonts w:ascii="Times New Roman" w:hAnsi="Times New Roman"/>
                 <w:sz w:val="20"/>
               </w:rPr>
-              <w:t>4 pt, 0.7</w:t>
+              <w:t>6 pt, 0.7</w:t>
             </w:r>
           </w:p>
         </w:tc>
         <w:tc>
           <w:tcPr>
-            <w:tcW w:type="dxa" w:w="1337"/>
+            <w:tcW w:type="dxa" w:w="1560"/>
           </w:tcPr>
           <w:p>
             <w:r>
@@ -1126,13 +1428,13 @@
                 <w:rFonts w:ascii="Times New Roman" w:hAnsi="Times New Roman"/>
                 <w:sz w:val="20"/>
               </w:rPr>
-              <w:t>0.411</w:t>
+              <w:t>0.451</w:t>
             </w:r>
           </w:p>
         </w:tc>
         <w:tc>
           <w:tcPr>
-            <w:tcW w:type="dxa" w:w="1337"/>
+            <w:tcW w:type="dxa" w:w="1560"/>
           </w:tcPr>
           <w:p>
             <w:r>
@@ -1140,13 +1442,13 @@
                 <w:rFonts w:ascii="Times New Roman" w:hAnsi="Times New Roman"/>
                 <w:sz w:val="20"/>
               </w:rPr>
-              <w:t>-</w:t>
+              <w:t>1.36</w:t>
             </w:r>
           </w:p>
         </w:tc>
         <w:tc>
           <w:tcPr>
-            <w:tcW w:type="dxa" w:w="1337"/>
+            <w:tcW w:type="dxa" w:w="1560"/>
           </w:tcPr>
           <w:p>
             <w:r>
@@ -1154,13 +1456,13 @@
                 <w:rFonts w:ascii="Times New Roman" w:hAnsi="Times New Roman"/>
                 <w:sz w:val="20"/>
               </w:rPr>
-              <w:t>1.38</w:t>
+              <w:t>133</w:t>
             </w:r>
           </w:p>
         </w:tc>
         <w:tc>
           <w:tcPr>
-            <w:tcW w:type="dxa" w:w="1337"/>
+            <w:tcW w:type="dxa" w:w="1560"/>
           </w:tcPr>
           <w:p>
             <w:r>
@@ -1168,21 +1470,7 @@
                 <w:rFonts w:ascii="Times New Roman" w:hAnsi="Times New Roman"/>
                 <w:sz w:val="20"/>
               </w:rPr>
-              <w:t>131</w:t>
-            </w:r>
-          </w:p>
-        </w:tc>
-        <w:tc>
-          <w:tcPr>
-            <w:tcW w:type="dxa" w:w="1337"/>
-          </w:tcPr>
-          <w:p>
-            <w:r>
-              <w:rPr>
-                <w:rFonts w:ascii="Times New Roman" w:hAnsi="Times New Roman"/>
-                <w:sz w:val="20"/>
-              </w:rPr>
-              <w:t>3.40%</w:t>
+              <w:t>209 (7.6%)</w:t>
             </w:r>
           </w:p>
         </w:tc>
@@ -1190,7 +1478,7 @@
     </w:tbl>
     <w:p>
       <w:r>
-        <w:t>The full grid supports the same conclusion. All nine Flash Lite configurations beat all 18 Gemini 3 Flash configurations on MAE in the presentation analysis. Model family accounted for the largest share of performance variation across the grid, ahead of scale granularity and temperature. Bootstrap comparisons favored Flash Lite, with estimated probabilities of 99.3% versus Gemini 3 minimal thinking and 91.2% versus Gemini 3 low thinking.</w:t>
+        <w:t>The full grid supports the same conclusion without relying on one scale setting. Gemini 2.5 Flash Lite had the highest model-family mean R² and the best overall configuration; its nine configurations occupied nine of the top ten positions by R². The best Gemini 3 Flash low-thinking configuration used an eight-point scale and temperature 0.7, with R² = 0.518 and MAE = 1.26, still below the best Flash Lite result. Bootstrap comparisons favored Flash Lite, with estimated winning probabilities of 99.3% versus Gemini 3 Flash minimal thinking and 91.2% versus Gemini 3 Flash low thinking among the selected top configurations.</w:t>
       </w:r>
     </w:p>
     <w:p>
@@ -1247,14 +1535,14 @@
     </w:p>
     <w:p>
       <w:r>
-        <w:t>The tested reasoning-oriented configurations also carried operational costs. Runtime increased sharply for Gemini 3 Flash low thinking, and structured-output failures were more frequent for Gemini 3 Flash minimal thinking. These failures matter because the pipeline depends on thousands of parseable JSON responses.</w:t>
+        <w:t>The tested reasoning-oriented configurations also carried operational costs. Runtime increased sharply for Gemini 3 Flash low thinking. At the same six-point scale and temperature 0.7, Gemini 3 Flash minimal thinking also produced more row-level scoring errors. These failures matter because the pipeline depends on thousands of parseable JSON responses.</w:t>
       </w:r>
     </w:p>
     <w:p>
       <w:r>
         <w:drawing>
           <wp:inline xmlns:a="http://schemas.openxmlformats.org/drawingml/2006/main" xmlns:pic="http://schemas.openxmlformats.org/drawingml/2006/picture">
-            <wp:extent cx="5394960" cy="2631966"/>
+            <wp:extent cx="5394960" cy="2606330"/>
             <wp:docPr id="3" name="Picture 3"/>
             <wp:cNvGraphicFramePr>
               <a:graphicFrameLocks noChangeAspect="1"/>
@@ -1275,7 +1563,7 @@
                   <pic:spPr>
                     <a:xfrm>
                       <a:off x="0" y="0"/>
-                      <a:ext cx="5394960" cy="2631966"/>
+                      <a:ext cx="5394960" cy="2606330"/>
                     </a:xfrm>
                     <a:prstGeom prst="rect"/>
                   </pic:spPr>
@@ -1291,7 +1579,7 @@
         <w:pStyle w:val="Caption"/>
       </w:pPr>
       <w:r>
-        <w:t>Operational comparison for highlighted configurations. A useful scorer must be accurate, fast enough to run across thousands of rows, and reliable enough to return parseable structured output.</w:t>
+        <w:t>Operational comparison for the controlled six-point, temperature 0.7 configurations. A useful scorer must be accurate, fast enough to run across thousands of rows, and reliable enough to return parseable structured output.</w:t>
       </w:r>
     </w:p>
     <w:p>
@@ -1329,7 +1617,7 @@
       <w:r>
         <w:drawing>
           <wp:inline xmlns:a="http://schemas.openxmlformats.org/drawingml/2006/main" xmlns:pic="http://schemas.openxmlformats.org/drawingml/2006/picture">
-            <wp:extent cx="5394960" cy="3032611"/>
+            <wp:extent cx="5394960" cy="3053064"/>
             <wp:docPr id="4" name="Picture 4"/>
             <wp:cNvGraphicFramePr>
               <a:graphicFrameLocks noChangeAspect="1"/>
@@ -1350,7 +1638,7 @@
                   <pic:spPr>
                     <a:xfrm>
                       <a:off x="0" y="0"/>
-                      <a:ext cx="5394960" cy="3032611"/>
+                      <a:ext cx="5394960" cy="3053064"/>
                     </a:xfrm>
                     <a:prstGeom prst="rect"/>
                   </pic:spPr>
@@ -1366,7 +1654,7 @@
         <w:pStyle w:val="Caption"/>
       </w:pPr>
       <w:r>
-        <w:t>Modality-level sanity check. The two bars are not in the same units: Mahieu et al. values summarize modality signal from the original descriptor-based analysis, while our values are downstream model feature importances from LLM alignment scores. The comparison is about order and structure.</w:t>
+        <w:t>Modality-level sanity check. Values are normalized within method so the comparison is about order and relative share, not raw units. Mahieu et al. values summarize modality signal from the original descriptor-based analysis, while our values are downstream model feature importances from LLM alignment scores.</w:t>
       </w:r>
     </w:p>
     <w:p>
@@ -1448,7 +1736,7 @@
                 <w:b/>
                 <w:sz w:val="20"/>
               </w:rPr>
-              <w:t>Parse errors</w:t>
+              <w:t>Quantity</w:t>
             </w:r>
           </w:p>
         </w:tc>
@@ -1461,6 +1749,66 @@
               <w:rPr>
                 <w:rFonts w:ascii="Times New Roman" w:hAnsi="Times New Roman"/>
                 <w:b/>
+                <w:sz w:val="20"/>
+              </w:rPr>
+              <w:t>Result</w:t>
+            </w:r>
+          </w:p>
+        </w:tc>
+      </w:tr>
+      <w:tr>
+        <w:tc>
+          <w:tcPr>
+            <w:tcW w:type="dxa" w:w="4680"/>
+          </w:tcPr>
+          <w:p>
+            <w:r>
+              <w:rPr>
+                <w:rFonts w:ascii="Times New Roman" w:hAnsi="Times New Roman"/>
+                <w:sz w:val="20"/>
+              </w:rPr>
+              <w:t>Valid topic-level rows</w:t>
+            </w:r>
+          </w:p>
+        </w:tc>
+        <w:tc>
+          <w:tcPr>
+            <w:tcW w:type="dxa" w:w="4680"/>
+          </w:tcPr>
+          <w:p>
+            <w:r>
+              <w:rPr>
+                <w:rFonts w:ascii="Times New Roman" w:hAnsi="Times New Roman"/>
+                <w:sz w:val="20"/>
+              </w:rPr>
+              <w:t>2,757</w:t>
+            </w:r>
+          </w:p>
+        </w:tc>
+      </w:tr>
+      <w:tr>
+        <w:tc>
+          <w:tcPr>
+            <w:tcW w:type="dxa" w:w="4680"/>
+          </w:tcPr>
+          <w:p>
+            <w:r>
+              <w:rPr>
+                <w:rFonts w:ascii="Times New Roman" w:hAnsi="Times New Roman"/>
+                <w:sz w:val="20"/>
+              </w:rPr>
+              <w:t>Unparsed topic rows</w:t>
+            </w:r>
+          </w:p>
+        </w:tc>
+        <w:tc>
+          <w:tcPr>
+            <w:tcW w:type="dxa" w:w="4680"/>
+          </w:tcPr>
+          <w:p>
+            <w:r>
+              <w:rPr>
+                <w:rFonts w:ascii="Times New Roman" w:hAnsi="Times New Roman"/>
                 <w:sz w:val="20"/>
               </w:rPr>
               <w:t>1</w:t>
@@ -1723,7 +2071,7 @@
                 <w:b/>
                 <w:sz w:val="20"/>
               </w:rPr>
-              <w:t>XGBoost</w:t>
+              <w:t>Downstream learner</w:t>
             </w:r>
           </w:p>
         </w:tc>
@@ -1738,6 +2086,95 @@
                 <w:b/>
                 <w:sz w:val="20"/>
               </w:rPr>
+              <w:t>Mean R²</w:t>
+            </w:r>
+          </w:p>
+        </w:tc>
+        <w:tc>
+          <w:tcPr>
+            <w:tcW w:type="dxa" w:w="3120"/>
+          </w:tcPr>
+          <w:p>
+            <w:r>
+              <w:rPr>
+                <w:rFonts w:ascii="Times New Roman" w:hAnsi="Times New Roman"/>
+                <w:b/>
+                <w:sz w:val="20"/>
+              </w:rPr>
+              <w:t>Configurations won</w:t>
+            </w:r>
+          </w:p>
+        </w:tc>
+      </w:tr>
+      <w:tr>
+        <w:tc>
+          <w:tcPr>
+            <w:tcW w:type="dxa" w:w="3120"/>
+          </w:tcPr>
+          <w:p>
+            <w:r>
+              <w:rPr>
+                <w:rFonts w:ascii="Times New Roman" w:hAnsi="Times New Roman"/>
+                <w:sz w:val="20"/>
+              </w:rPr>
+              <w:t>TabPFN v2</w:t>
+            </w:r>
+          </w:p>
+        </w:tc>
+        <w:tc>
+          <w:tcPr>
+            <w:tcW w:type="dxa" w:w="3120"/>
+          </w:tcPr>
+          <w:p>
+            <w:r>
+              <w:rPr>
+                <w:rFonts w:ascii="Times New Roman" w:hAnsi="Times New Roman"/>
+                <w:sz w:val="20"/>
+              </w:rPr>
+              <w:t>0.476</w:t>
+            </w:r>
+          </w:p>
+        </w:tc>
+        <w:tc>
+          <w:tcPr>
+            <w:tcW w:type="dxa" w:w="3120"/>
+          </w:tcPr>
+          <w:p>
+            <w:r>
+              <w:rPr>
+                <w:rFonts w:ascii="Times New Roman" w:hAnsi="Times New Roman"/>
+                <w:sz w:val="20"/>
+              </w:rPr>
+              <w:t>74%</w:t>
+            </w:r>
+          </w:p>
+        </w:tc>
+      </w:tr>
+      <w:tr>
+        <w:tc>
+          <w:tcPr>
+            <w:tcW w:type="dxa" w:w="3120"/>
+          </w:tcPr>
+          <w:p>
+            <w:r>
+              <w:rPr>
+                <w:rFonts w:ascii="Times New Roman" w:hAnsi="Times New Roman"/>
+                <w:sz w:val="20"/>
+              </w:rPr>
+              <w:t>XGBoost</w:t>
+            </w:r>
+          </w:p>
+        </w:tc>
+        <w:tc>
+          <w:tcPr>
+            <w:tcW w:type="dxa" w:w="3120"/>
+          </w:tcPr>
+          <w:p>
+            <w:r>
+              <w:rPr>
+                <w:rFonts w:ascii="Times New Roman" w:hAnsi="Times New Roman"/>
+                <w:sz w:val="20"/>
+              </w:rPr>
               <w:t>0.474</w:t>
             </w:r>
           </w:p>
@@ -1750,7 +2187,6 @@
             <w:r>
               <w:rPr>
                 <w:rFonts w:ascii="Times New Roman" w:hAnsi="Times New Roman"/>
-                <w:b/>
                 <w:sz w:val="20"/>
               </w:rPr>
               <w:t>-</w:t>
@@ -1944,12 +2380,12 @@
     </w:p>
     <w:p>
       <w:r>
-        <w:t>The main model comparison is limited to Gemini configurations. The paper should not claim that all reasoning models behave the same way. It should claim that the tested reasoning configurations did not help this sensory scoring task, and that the result supports a broader task-fit hypothesis worth testing.</w:t>
+        <w:t>The main model comparison is limited to Gemini configurations. The result should not be read as a universal claim about every reasoning model from every provider. It shows that the tested Gemini reasoning configurations did not help this sensory scoring task, and it supports a broader task-fit hypothesis worth testing across model families.</w:t>
       </w:r>
     </w:p>
     <w:p>
       <w:r>
-        <w:t>Exact model aliases require audit. Any use of provider aliases must be resolved to stable model IDs and run dates before submission.</w:t>
+        <w:t>The provider model names are reported as the API aliases used at scoring time. Because model providers update aliases, the durable object is the benchmark loop and saved scoring artifacts, not a permanent ranking of named commercial models.</w:t>
       </w:r>
     </w:p>
     <w:p>
@@ -1959,12 +2395,12 @@
     </w:p>
     <w:p>
       <w:r>
-        <w:t>The topic-level predictive result currently uses Gradient Boosting as a placeholder. Topic-level TabPFN results should replace it if a stable TabPFN run becomes available.</w:t>
+        <w:t>The topic-level predictive result uses Gradient Boosting rather than TabPFN. It is included as a diagnostic extension of the modality and topic-rank validation, not as a replacement for the primary three-feature TabPFN result.</w:t>
       </w:r>
     </w:p>
     <w:p>
       <w:r>
-        <w:t>The topic-level comparison to Mahieu et al. (2022) uses mapped descriptor families and approximate driver strengths from processed paper notes. These mappings and values need to be checked against the primary paper or original code before final submission.</w:t>
+        <w:t>The topic-level comparison to Mahieu et al. (2022) uses mapped descriptor families and driver strengths extracted from the published paper and processed notes. It should be interpreted as a structural validation of modality and topic order, not as an exact re-estimation of every descriptor coefficient.</w:t>
       </w:r>
     </w:p>
     <w:p>

</xml_diff>

<commit_message>
Address final paper review gaps
</commit_message>
<xml_diff>
--- a/paper/manuscript.docx
+++ b/paper/manuscript.docx
@@ -608,7 +608,7 @@
         <w:jc w:val="center"/>
       </w:pPr>
       <w:r>
-        <w:t>\"visual": X,\ "texture": X,\ "flavor": X\.</w:t>
+        <w:t>{"visual": X, "texture": X, "flavor": X}.</w:t>
       </w:r>
     </w:p>
     <w:p>
@@ -931,7 +931,7 @@
         <w:jc w:val="center"/>
       </w:pPr>
       <w:r>
-        <w:t>R² = 1 - _i (y_i-y_i)^2_i (y_i-y)^2, MAE = 1n_i |y_i-y_i|.</w:t>
+        <w:t>R² = 1 - sum_i (y_i - y-hat_i)^2 / sum_i (y_i - y-bar)^2; MAE = (1/n) sum_i |y_i - y-hat_i|.</w:t>
       </w:r>
     </w:p>
     <w:p>
@@ -952,7 +952,7 @@
         <w:jc w:val="center"/>
       </w:pPr>
       <w:r>
-        <w:t>(a,i) = ai\|a\|\|i\|.</w:t>
+        <w:t>cos(a, i) = (a · i) / (||a|| ||i||).</w:t>
       </w:r>
     </w:p>
     <w:p>
@@ -1478,7 +1478,7 @@
     </w:tbl>
     <w:p>
       <w:r>
-        <w:t>The full grid supports the same conclusion without relying on one scale setting. Gemini 2.5 Flash Lite had the highest model-family mean R² and the best overall configuration; its nine configurations occupied nine of the top ten positions by R². The best Gemini 3 Flash low-thinking configuration used an eight-point scale and temperature 0.7, with R² = 0.518 and MAE = 1.26, still below the best Flash Lite result. Bootstrap comparisons favored Flash Lite, with estimated winning probabilities of 99.3% versus Gemini 3 Flash minimal thinking and 91.2% versus Gemini 3 Flash low thinking among the selected top configurations.</w:t>
+        <w:t>The full grid supports the same conclusion without relying on one scale setting. Gemini 2.5 Flash Lite had the highest model-family mean R² and the best overall configuration; its nine configurations occupied nine of the top ten positions by R². The best Gemini 3 Flash low-thinking configuration used an eight-point scale and temperature 0.7, with R² = 0.518 and MAE = 1.26, still below the best Flash Lite result. Bootstrap comparisons favored Flash Lite, with estimated family-level winning probabilities of 99.3% versus Gemini 3 Flash minimal thinking and 91.2% versus Gemini 3 Flash low thinking among the selected top configurations.</w:t>
       </w:r>
     </w:p>
     <w:p>
@@ -2037,7 +2037,7 @@
     </w:p>
     <w:p>
       <w:r>
-        <w:t>The downstream model comparison was not the headline result, but it matters for the workflow. TabPFN, XGBoost, Gradient Boosting, and Ridge were nearly tied in mean R² across configurations, with Random Forest behind. TabPFN had the best mean R² in the slide analysis at 0.476 and won 74% of configurations. XGBoost was close at 0.474. The reason for using TabPFN is operational. The accuracy margin was modest, but TabPFN required no separate hyperparameter search and runs as a single tabular forward pass.</w:t>
+        <w:t>The downstream model comparison was not the headline result, but it matters for the workflow. Across the 27 LLM scoring configurations, TabPFN had the best mean R² at 0.482 and won 20 of 27 configurations. Ridge Regression was the closest conventional baseline at 0.468. The reason for using TabPFN is operational. The accuracy margin was modest, but TabPFN required no separate hyperparameter search and runs as a single tabular forward pass.</w:t>
       </w:r>
     </w:p>
     <w:p>
@@ -2045,7 +2045,7 @@
         <w:pStyle w:val="Caption"/>
       </w:pPr>
       <w:r>
-        <w:t>Downstream model comparison across LLM configuration combinations.</w:t>
+        <w:t>Downstream model comparison across the 27 LLM scoring configurations.</w:t>
       </w:r>
     </w:p>
     <w:tbl>
@@ -2131,7 +2131,7 @@
                 <w:rFonts w:ascii="Times New Roman" w:hAnsi="Times New Roman"/>
                 <w:sz w:val="20"/>
               </w:rPr>
-              <w:t>0.476</w:t>
+              <w:t>0.482</w:t>
             </w:r>
           </w:p>
         </w:tc>
@@ -2145,7 +2145,139 @@
                 <w:rFonts w:ascii="Times New Roman" w:hAnsi="Times New Roman"/>
                 <w:sz w:val="20"/>
               </w:rPr>
-              <w:t>74%</w:t>
+              <w:t>20 (74.1%)</w:t>
+            </w:r>
+          </w:p>
+        </w:tc>
+      </w:tr>
+      <w:tr>
+        <w:tc>
+          <w:tcPr>
+            <w:tcW w:type="dxa" w:w="3120"/>
+          </w:tcPr>
+          <w:p>
+            <w:r>
+              <w:rPr>
+                <w:rFonts w:ascii="Times New Roman" w:hAnsi="Times New Roman"/>
+                <w:sz w:val="20"/>
+              </w:rPr>
+              <w:t>Ridge Regression</w:t>
+            </w:r>
+          </w:p>
+        </w:tc>
+        <w:tc>
+          <w:tcPr>
+            <w:tcW w:type="dxa" w:w="3120"/>
+          </w:tcPr>
+          <w:p>
+            <w:r>
+              <w:rPr>
+                <w:rFonts w:ascii="Times New Roman" w:hAnsi="Times New Roman"/>
+                <w:sz w:val="20"/>
+              </w:rPr>
+              <w:t>0.468</w:t>
+            </w:r>
+          </w:p>
+        </w:tc>
+        <w:tc>
+          <w:tcPr>
+            <w:tcW w:type="dxa" w:w="3120"/>
+          </w:tcPr>
+          <w:p>
+            <w:r>
+              <w:rPr>
+                <w:rFonts w:ascii="Times New Roman" w:hAnsi="Times New Roman"/>
+                <w:sz w:val="20"/>
+              </w:rPr>
+              <w:t>7 (25.9%)</w:t>
+            </w:r>
+          </w:p>
+        </w:tc>
+      </w:tr>
+      <w:tr>
+        <w:tc>
+          <w:tcPr>
+            <w:tcW w:type="dxa" w:w="3120"/>
+          </w:tcPr>
+          <w:p>
+            <w:r>
+              <w:rPr>
+                <w:rFonts w:ascii="Times New Roman" w:hAnsi="Times New Roman"/>
+                <w:sz w:val="20"/>
+              </w:rPr>
+              <w:t>Gradient Boosting</w:t>
+            </w:r>
+          </w:p>
+        </w:tc>
+        <w:tc>
+          <w:tcPr>
+            <w:tcW w:type="dxa" w:w="3120"/>
+          </w:tcPr>
+          <w:p>
+            <w:r>
+              <w:rPr>
+                <w:rFonts w:ascii="Times New Roman" w:hAnsi="Times New Roman"/>
+                <w:sz w:val="20"/>
+              </w:rPr>
+              <w:t>0.450</w:t>
+            </w:r>
+          </w:p>
+        </w:tc>
+        <w:tc>
+          <w:tcPr>
+            <w:tcW w:type="dxa" w:w="3120"/>
+          </w:tcPr>
+          <w:p>
+            <w:r>
+              <w:rPr>
+                <w:rFonts w:ascii="Times New Roman" w:hAnsi="Times New Roman"/>
+                <w:sz w:val="20"/>
+              </w:rPr>
+              <w:t>0</w:t>
+            </w:r>
+          </w:p>
+        </w:tc>
+      </w:tr>
+      <w:tr>
+        <w:tc>
+          <w:tcPr>
+            <w:tcW w:type="dxa" w:w="3120"/>
+          </w:tcPr>
+          <w:p>
+            <w:r>
+              <w:rPr>
+                <w:rFonts w:ascii="Times New Roman" w:hAnsi="Times New Roman"/>
+                <w:sz w:val="20"/>
+              </w:rPr>
+              <w:t>Random Forest</w:t>
+            </w:r>
+          </w:p>
+        </w:tc>
+        <w:tc>
+          <w:tcPr>
+            <w:tcW w:type="dxa" w:w="3120"/>
+          </w:tcPr>
+          <w:p>
+            <w:r>
+              <w:rPr>
+                <w:rFonts w:ascii="Times New Roman" w:hAnsi="Times New Roman"/>
+                <w:sz w:val="20"/>
+              </w:rPr>
+              <w:t>0.446</w:t>
+            </w:r>
+          </w:p>
+        </w:tc>
+        <w:tc>
+          <w:tcPr>
+            <w:tcW w:type="dxa" w:w="3120"/>
+          </w:tcPr>
+          <w:p>
+            <w:r>
+              <w:rPr>
+                <w:rFonts w:ascii="Times New Roman" w:hAnsi="Times New Roman"/>
+                <w:sz w:val="20"/>
+              </w:rPr>
+              <w:t>0</w:t>
             </w:r>
           </w:p>
         </w:tc>
@@ -2175,7 +2307,7 @@
                 <w:rFonts w:ascii="Times New Roman" w:hAnsi="Times New Roman"/>
                 <w:sz w:val="20"/>
               </w:rPr>
-              <w:t>0.474</w:t>
+              <w:t>0.438</w:t>
             </w:r>
           </w:p>
         </w:tc>
@@ -2189,139 +2321,7 @@
                 <w:rFonts w:ascii="Times New Roman" w:hAnsi="Times New Roman"/>
                 <w:sz w:val="20"/>
               </w:rPr>
-              <w:t>-</w:t>
-            </w:r>
-          </w:p>
-        </w:tc>
-      </w:tr>
-      <w:tr>
-        <w:tc>
-          <w:tcPr>
-            <w:tcW w:type="dxa" w:w="3120"/>
-          </w:tcPr>
-          <w:p>
-            <w:r>
-              <w:rPr>
-                <w:rFonts w:ascii="Times New Roman" w:hAnsi="Times New Roman"/>
-                <w:sz w:val="20"/>
-              </w:rPr>
-              <w:t>Gradient Boosting</w:t>
-            </w:r>
-          </w:p>
-        </w:tc>
-        <w:tc>
-          <w:tcPr>
-            <w:tcW w:type="dxa" w:w="3120"/>
-          </w:tcPr>
-          <w:p>
-            <w:r>
-              <w:rPr>
-                <w:rFonts w:ascii="Times New Roman" w:hAnsi="Times New Roman"/>
-                <w:sz w:val="20"/>
-              </w:rPr>
-              <w:t>0.473</w:t>
-            </w:r>
-          </w:p>
-        </w:tc>
-        <w:tc>
-          <w:tcPr>
-            <w:tcW w:type="dxa" w:w="3120"/>
-          </w:tcPr>
-          <w:p>
-            <w:r>
-              <w:rPr>
-                <w:rFonts w:ascii="Times New Roman" w:hAnsi="Times New Roman"/>
-                <w:sz w:val="20"/>
-              </w:rPr>
-              <w:t>-</w:t>
-            </w:r>
-          </w:p>
-        </w:tc>
-      </w:tr>
-      <w:tr>
-        <w:tc>
-          <w:tcPr>
-            <w:tcW w:type="dxa" w:w="3120"/>
-          </w:tcPr>
-          <w:p>
-            <w:r>
-              <w:rPr>
-                <w:rFonts w:ascii="Times New Roman" w:hAnsi="Times New Roman"/>
-                <w:sz w:val="20"/>
-              </w:rPr>
-              <w:t>Ridge Regression</w:t>
-            </w:r>
-          </w:p>
-        </w:tc>
-        <w:tc>
-          <w:tcPr>
-            <w:tcW w:type="dxa" w:w="3120"/>
-          </w:tcPr>
-          <w:p>
-            <w:r>
-              <w:rPr>
-                <w:rFonts w:ascii="Times New Roman" w:hAnsi="Times New Roman"/>
-                <w:sz w:val="20"/>
-              </w:rPr>
-              <w:t>0.469</w:t>
-            </w:r>
-          </w:p>
-        </w:tc>
-        <w:tc>
-          <w:tcPr>
-            <w:tcW w:type="dxa" w:w="3120"/>
-          </w:tcPr>
-          <w:p>
-            <w:r>
-              <w:rPr>
-                <w:rFonts w:ascii="Times New Roman" w:hAnsi="Times New Roman"/>
-                <w:sz w:val="20"/>
-              </w:rPr>
-              <w:t>-</w:t>
-            </w:r>
-          </w:p>
-        </w:tc>
-      </w:tr>
-      <w:tr>
-        <w:tc>
-          <w:tcPr>
-            <w:tcW w:type="dxa" w:w="3120"/>
-          </w:tcPr>
-          <w:p>
-            <w:r>
-              <w:rPr>
-                <w:rFonts w:ascii="Times New Roman" w:hAnsi="Times New Roman"/>
-                <w:sz w:val="20"/>
-              </w:rPr>
-              <w:t>Random Forest</w:t>
-            </w:r>
-          </w:p>
-        </w:tc>
-        <w:tc>
-          <w:tcPr>
-            <w:tcW w:type="dxa" w:w="3120"/>
-          </w:tcPr>
-          <w:p>
-            <w:r>
-              <w:rPr>
-                <w:rFonts w:ascii="Times New Roman" w:hAnsi="Times New Roman"/>
-                <w:sz w:val="20"/>
-              </w:rPr>
-              <w:t>0.444</w:t>
-            </w:r>
-          </w:p>
-        </w:tc>
-        <w:tc>
-          <w:tcPr>
-            <w:tcW w:type="dxa" w:w="3120"/>
-          </w:tcPr>
-          <w:p>
-            <w:r>
-              <w:rPr>
-                <w:rFonts w:ascii="Times New Roman" w:hAnsi="Times New Roman"/>
-                <w:sz w:val="20"/>
-              </w:rPr>
-              <w:t>-</w:t>
+              <w:t>0</w:t>
             </w:r>
           </w:p>
         </w:tc>
@@ -2400,7 +2400,7 @@
     </w:p>
     <w:p>
       <w:r>
-        <w:t>The topic-level comparison to Mahieu et al. (2022) uses mapped descriptor families and driver strengths extracted from the published paper and processed notes. It should be interpreted as a structural validation of modality and topic order, not as an exact re-estimation of every descriptor coefficient.</w:t>
+        <w:t>The topic-level comparison to Mahieu et al. (2022) uses mapped descriptor families and driver strengths coded from the published figure and processed notes. It should be interpreted as a structural validation of modality and topic order, not as an exact re-estimation of every descriptor coefficient.</w:t>
       </w:r>
     </w:p>
     <w:p>

</xml_diff>

<commit_message>
Cite single ideal IPM paper
</commit_message>
<xml_diff>
--- a/paper/manuscript.docx
+++ b/paper/manuscript.docx
@@ -203,7 +203,7 @@
     </w:p>
     <w:p>
       <w:r>
-        <w:t>IFC, used in the cooked-ham case study of Mahieu et al. (2022), adds the consumer's own ideal product description. Existing products cover only part of the sensory space, and a consumer's ideal may lie outside the product set. Mahieu et al. (2022) showed that drivers of liking and ideal-product descriptions provide complementary information, and that ideal descriptions can reveal consumer segments.</w:t>
+        <w:t>IFC, used in the cooked-ham case study of Mahieu et al. (2022), adds the consumer's own ideal product description. Existing products cover only part of the sensory space, and a consumer's ideal may lie outside the product set. This follows a longer line of ideal-product methods. The Ideal Profile Method asks consumers to rate both perceived and ideal intensities for each tested product on a structured attribute list (Worch et al., 2013). Related work used IPM to test whether the assumption of one internal ideal is tenable when products may cue different ideals (Worch and Ennis, 2013). IFC keeps the actual-versus-ideal logic but replaces the fixed attribute list with consumers' own words. Mahieu et al. (2022) showed that drivers of liking and ideal-product descriptions provide complementary information, and that ideal descriptions can reveal consumer segments.</w:t>
       </w:r>
     </w:p>
     <w:p>
@@ -2702,6 +2702,14 @@
         <w:ind w:hanging="360" w:left="360"/>
       </w:pPr>
       <w:r>
+        <w:t>Worch, T., &amp; Ennis, J. M. (2013). Investigating the single ideal assumption using Ideal Profile Method. Food Quality and Preference, 29(1), 40-47. https://doi.org/10.1016/j.foodqual.2013.01.005.</w:t>
+      </w:r>
+    </w:p>
+    <w:p>
+      <w:pPr>
+        <w:ind w:hanging="360" w:left="360"/>
+      </w:pPr>
+      <w:r>
         <w:t>Zheng, L., Chiang, W.-L., Sheng, Y., Zhuang, S., Wu, Z., Zhuang, Y., Lin, Z., Li, Z., Li, D., Xing, E. P., Zhang, H., Gonzalez, J. E., &amp; Stoica, I. (2023). Judging LLM-as-a-judge with MT-Bench and Chatbot Arena. Advances in Neural Information Processing Systems. arXiv:2306.05685. https://arxiv.org/abs/2306.05685.</w:t>
       </w:r>
     </w:p>

</xml_diff>

<commit_message>
Add embedding baseline results to paper
</commit_message>
<xml_diff>
--- a/paper/manuscript.docx
+++ b/paper/manuscript.docx
@@ -74,7 +74,7 @@
     </w:p>
     <w:p>
       <w:r>
-        <w:t>Larger and more deliberative language models are often assumed to be better scoring instruments. That assumption may fail when the target response is sensory, affective, and fast. We tested this idea in a consumer cooked-ham study where the task was to score how closely each evaluated product matched each consumer's own ideal product. The data came from a published Ideal-Free-Comment study: 2,758 home-use evaluations from 483 French consumers across 30 commercial cooked hams. Consumers described actual products and their ideal ham using Free-Comment across visual appearance, texture, and flavor, then rated liking on a 0-10 visual analogue scale. For each evaluation, a large language model compared actual and ideal comments and returned structured Likert alignment scores. Those scores were used to predict liking under consumer-group holdout validation. A raw embedding cosine-similarity baseline performed poorly, with R² near 0.20 and MAE near 1.83. Direct LLM alignment scoring improved prediction substantially. In the primary analysis, Gemini 2.5 Flash Lite, a non-thinking direct-response model, reached R² = 0.573 and MAE = 1.22 with a six-point scale and temperature 0.7; bootstrap validation gave mean R² = 0.504. Reasoning-oriented Gemini 3 Flash configurations were slower, less accurate, and showed more row-level scoring errors in controlled six-point comparisons. Topic-level validation recovered the published modality hierarchy, with flavor strongest, texture second, and visual appearance weakest. The findings support a model-cognition fit hypothesis: for sensory and consumer scoring tasks, non-thinking models can be better matched to the fast judgment process being measured, while reasoning models may add cost and noise.</w:t>
+        <w:t>Larger and more deliberative language models are often assumed to be better scoring instruments. That assumption may fail when the target response is sensory, affective, and fast. We tested this idea in a consumer cooked-ham study where the task was to score how closely each evaluated product matched each consumer's own ideal product. The data came from a published Ideal-Free-Comment study: 2,758 home-use evaluations from 483 French consumers across 30 commercial cooked hams. Consumers described actual products and their ideal ham using Free-Comment across visual appearance, texture, and flavor, then rated liking on a 0-10 visual analogue scale. For each evaluation, a large language model compared actual and ideal comments and returned structured Likert alignment scores. Those scores were used to predict liking under consumer-group holdout validation. Embedding cosine-similarity baselines performed poorly, even when the embeddings were framed around the same three sensory modalities. Direct LLM alignment scoring improved prediction substantially. In the primary analysis, Gemini 2.5 Flash Lite, a non-thinking direct-response model, reached R² = 0.573 and MAE = 1.22 with a six-point scale and temperature 0.7; bootstrap validation gave mean R² = 0.504. Reasoning-oriented Gemini 3 Flash configurations were slower, less accurate, and showed more row-level scoring errors in controlled six-point comparisons. Topic-level validation recovered the published modality hierarchy, with flavor strongest, texture second, and visual appearance weakest. The findings support a model-cognition fit hypothesis: for sensory and consumer scoring tasks, non-thinking models can be better matched to the fast judgment process being measured, while reasoning models may add cost and noise.</w:t>
       </w:r>
     </w:p>
     <w:p>
@@ -962,6 +962,11 @@
     </w:p>
     <w:p>
       <w:r>
+        <w:t>We also ran a stricter embedding-only check in the same shape as the direct scoring pipeline. Using EmbeddingGemma, we computed three actual-versus-ideal cosine similarities per row: visual, texture, and flavor. We tested raw semantic textual similarity embeddings, modality-tagged embeddings, question-and-answer-framed embeddings, and retrieval-document embeddings. The question-and-answer version put the modality question into the text before embedding, so the embedding model had task context rather than bare comments alone. Downstream prediction for this diagnostic used standard scikit-learn regressors over 50 consumer-group splits and AutoGluon on the fixed consumer holdout (Erickson et al., 2020).</w:t>
+      </w:r>
+    </w:p>
+    <w:p>
+      <w:r>
         <w:t>The direct LLM scoring pipeline produced compact tabular features. These features were passed to downstream models to predict liking. The main model in the presentation analysis was TabPFN. Other downstream models were also compared, including XGBoost, Gradient Boosting, Ridge Regression, and Random Forest.</w:t>
       </w:r>
     </w:p>
@@ -1002,6 +1007,11 @@
     <w:p>
       <w:r>
         <w:t>The embedding baseline performed poorly, with R² near 0.20 and MAE near 1.83. This is informative because the task is not simply to decide whether two comments are semantically close. A consumer might describe an actual ham and an ideal ham with overlapping words but different sensory implications. Another consumer might use different words to describe a close match. Raw cosine similarity does not force the comparison to respect modality, hedonic direction, or consumer-specific ideals.</w:t>
+      </w:r>
+    </w:p>
+    <w:p>
+      <w:r>
+        <w:t>The stricter three-score embedding check led to the same conclusion. The best variant used question-and-answer-framed EmbeddingGemma similarities and ExtraTrees regression, reaching mean R² = 0.135 across 50 consumer-group splits. On the fixed holdout, question-and-answer-framed similarities with AutoGluon reached R² = 0.063, MAE = 1.83, and Pearson r = 0.31. Raw, modality-tagged, and retrieval-document variants were weaker. This was not a minimal embedding baseline. Even task-framed embeddings did not recover the relational sensory signal that direct scoring captured.</w:t>
       </w:r>
     </w:p>
     <w:p>
@@ -2342,7 +2352,7 @@
     </w:p>
     <w:p>
       <w:r>
-        <w:t>Direct LLM alignment scoring also turns IFC data into useful predictors of liking. The model receives paired actual and ideal consumer comments, scores sensory alignment, and produces tabular features that can be modeled with standard tools. In the cooked-ham dataset, those features predicted liking much better than raw embedding similarity and recovered the same broad sensory hierarchy as the original descriptor-based analysis.</w:t>
+        <w:t>Direct LLM alignment scoring also turns IFC data into useful predictors of liking. The model receives paired actual and ideal consumer comments, scores sensory alignment, and produces tabular features that can be modeled with standard tools. In the cooked-ham dataset, those features predicted liking much better than embedding similarity and recovered the same broad sensory hierarchy as the original descriptor-based analysis. The follow-up EmbeddingGemma checks strengthen that interpretation. A modern embedding model improved when we added modality labels and question-and-answer task framing, but the resulting similarity scores still behaved like semantic closeness measures rather than sensory alignment judgments.</w:t>
       </w:r>
     </w:p>
     <w:p>
@@ -2391,6 +2401,11 @@
     <w:p>
       <w:r>
         <w:t>Direct LLM scoring is not proper SSR. SSR may provide better-calibrated distributions and uncertainty information. A fair comparison should ask whether SSR's probability distributions improve calibration or whether direct scoring wins because the prompt focuses the model on the sensory comparison we care about.</w:t>
+      </w:r>
+    </w:p>
+    <w:p>
+      <w:r>
+        <w:t>The embedding baselines are also not the last word on embedding methods. A fine-tuned bi-encoder or a contrastive model trained on sensory alignment labels might perform better. The present result is narrower: off-the-shelf embeddings, even when prompted and reduced to the same three modality scores, did not explain liking nearly as well as direct LLM scoring.</w:t>
       </w:r>
     </w:p>
     <w:p>
@@ -2487,6 +2502,14 @@
       </w:pPr>
       <w:r>
         <w:t>Brand, J., Israeli, A., &amp; Ngwe, D. (2023). Using LLMs for market research. Harvard Business School Working Paper 23-062. https://papers.ssrn.com/sol3/papers.cfm?abstract_id=4395751.</w:t>
+      </w:r>
+    </w:p>
+    <w:p>
+      <w:pPr>
+        <w:ind w:hanging="360" w:left="360"/>
+      </w:pPr>
+      <w:r>
+        <w:t>Erickson, N., Mueller, J., Shirkov, A., Zhang, H., Larroy, P., Li, M., &amp; Smola, A. (2020). AutoGluon-Tabular: Robust and accurate AutoML for structured data. Preprint, arXiv:2003.06505. https://doi.org/10.48550/arXiv.2003.06505.</w:t>
       </w:r>
     </w:p>
     <w:p>

</xml_diff>

<commit_message>
Clarify embedding baseline wording
</commit_message>
<xml_diff>
--- a/paper/manuscript.docx
+++ b/paper/manuscript.docx
@@ -148,7 +148,7 @@
         <w:pStyle w:val="ListNumber"/>
       </w:pPr>
       <w:r>
-        <w:t>Can direct LLM alignment scores predict consumer liking better than raw embedding similarity?</w:t>
+        <w:t>Can direct LLM alignment scores predict consumer liking better than embedding-based similarity?</w:t>
       </w:r>
     </w:p>
     <w:p>
@@ -1001,7 +1001,7 @@
         <w:pStyle w:val="Heading2"/>
       </w:pPr>
       <w:r>
-        <w:t>Raw embeddings did not capture the actual-versus-ideal relation</w:t>
+        <w:t>Embeddings did not capture the actual-versus-ideal relation</w:t>
       </w:r>
     </w:p>
     <w:p>
@@ -2433,7 +2433,7 @@
     </w:p>
     <w:p>
       <w:r>
-        <w:t>Direct LLM alignment scoring offers a practical way to analyze Ideal-Free-Comment data, but the larger lesson is about model-cognition fit. In the cooked-ham case study, the non-thinking model was the better sensory scorer. It turned paired actual and ideal comments into compact predictors of liking, outperformed raw embedding similarity, and recovered the main sensory hierarchy from the original Free-Comment analysis. The reasoning-oriented configurations were slower, less accurate, and less reliable in structured output. For sensory and consumer analytics, the best LLM is not necessarily the largest or most deliberative one. It is the model whose response style fits the measurement task.</w:t>
+        <w:t>Direct LLM alignment scoring offers a practical way to analyze Ideal-Free-Comment data, but the larger lesson is about model-cognition fit. In the cooked-ham case study, the non-thinking model was the better sensory scorer. It turned paired actual and ideal comments into compact predictors of liking, outperformed embedding-based similarity, and recovered the main sensory hierarchy from the original Free-Comment analysis. The reasoning-oriented configurations were slower, less accurate, and less reliable in structured output. For sensory and consumer analytics, the best LLM is not necessarily the largest or most deliberative one. It is the model whose response style fits the measurement task.</w:t>
       </w:r>
     </w:p>
     <w:p>

</xml_diff>

<commit_message>
Run local TabPFN on embedding baselines
</commit_message>
<xml_diff>
--- a/paper/manuscript.docx
+++ b/paper/manuscript.docx
@@ -962,7 +962,7 @@
     </w:p>
     <w:p>
       <w:r>
-        <w:t>We also ran a stricter embedding-only check in the same shape as the direct scoring pipeline. Using EmbeddingGemma, we computed three actual-versus-ideal cosine similarities per row: visual, texture, and flavor. We tested raw semantic textual similarity embeddings, modality-tagged embeddings, question-and-answer-framed embeddings, and retrieval-document embeddings. The question-and-answer version put the modality question into the text before embedding, so the embedding model had task context rather than bare comments alone. Downstream prediction for this diagnostic used standard scikit-learn regressors over 50 consumer-group splits and AutoGluon on the fixed consumer holdout (Erickson et al., 2020).</w:t>
+        <w:t>We also ran a stricter embedding-only check in the same shape as the direct scoring pipeline. Using EmbeddingGemma, we computed three actual-versus-ideal cosine similarities per row: visual, texture, and flavor. We tested raw semantic textual similarity embeddings, modality-tagged embeddings, question-and-answer-framed embeddings, and retrieval-document embeddings. The question-and-answer version put the modality question into the text before embedding, so the embedding model had task context rather than bare comments alone. Downstream prediction for this diagnostic used standard scikit-learn regressors over 50 consumer-group splits, AutoGluon on the fixed consumer holdout (Erickson et al., 2020), and local TabPFN on the same fixed holdout (Hollmann et al., 2025).</w:t>
       </w:r>
     </w:p>
     <w:p>
@@ -1006,12 +1006,12 @@
     </w:p>
     <w:p>
       <w:r>
-        <w:t>The embedding baseline performed poorly, with R² near 0.20 and MAE near 1.83. This is informative because the task is not simply to decide whether two comments are semantically close. A consumer might describe an actual ham and an ideal ham with overlapping words but different sensory implications. Another consumer might use different words to describe a close match. Raw cosine similarity does not force the comparison to respect modality, hedonic direction, or consumer-specific ideals.</w:t>
+        <w:t>The initial embedding baseline performed poorly, with R² near 0.20 and MAE near 1.83. This is informative because the task is not simply to decide whether two comments are semantically close. A consumer might describe an actual ham and an ideal ham with overlapping words but different sensory implications. Another consumer might use different words to describe a close match. Raw cosine similarity does not force the comparison to respect modality, hedonic direction, or consumer-specific ideals.</w:t>
       </w:r>
     </w:p>
     <w:p>
       <w:r>
-        <w:t>The stricter three-score embedding check led to the same conclusion. The best variant used question-and-answer-framed EmbeddingGemma similarities and ExtraTrees regression, reaching mean R² = 0.135 across 50 consumer-group splits. On the fixed holdout, question-and-answer-framed similarities with AutoGluon reached R² = 0.063, MAE = 1.83, and Pearson r = 0.31. Raw, modality-tagged, and retrieval-document variants were weaker. This was not a minimal embedding baseline. Even task-framed embeddings did not recover the relational sensory signal that direct scoring captured.</w:t>
+        <w:t>The stricter three-score embedding check led to the same conclusion. The best repeated-split scikit-learn variant used question-and-answer-framed EmbeddingGemma similarities and ExtraTrees regression, reaching mean R² = 0.135 across 50 consumer-group splits. On the fixed holdout, question-and-answer-framed similarities reached R² = 0.063 with AutoGluon and R² = 0.170 with local TabPFN. The corresponding TabPFN MAE was 1.73. Raw, modality-tagged, and retrieval-document variants were weaker. This was not a minimal embedding baseline. Even task-framed embeddings did not recover the relational sensory signal that direct scoring captured.</w:t>
       </w:r>
     </w:p>
     <w:p>
@@ -1152,7 +1152,7 @@
                 <w:rFonts w:ascii="Times New Roman" w:hAnsi="Times New Roman"/>
                 <w:sz w:val="20"/>
               </w:rPr>
-              <w:t>Embedding baseline</w:t>
+              <w:t>Initial embedding baseline</w:t>
             </w:r>
           </w:p>
         </w:tc>

</xml_diff>